<commit_message>
feat: add full Spring Boot backend + Angular frontend
- Spring Boot 3.3.6 REST API with JWT auth, dynamic RBAC (ADR-001/021)
- PostgreSQL 17 + Flyway migrations V1-V16
- Angular 21 SPA: dashboard, projects, workload, missions, billing, governance
- Permission-gated UI (MANAGE_MISSION, VALIDATE_WORKLOAD, etc.)
- Project archiving, scope interceptor (chef/dev data isolation)
- Session expiry handling (401 redirect + banner)
- Comprehensive .gitignore (Maven, Angular, LaTeX, IDE artifacts)

Co-Authored-By: Claude Sonnet 4.6 <noreply@anthropic.com>
</commit_message>
<xml_diff>
--- a/docs/Project Plan.docx
+++ b/docs/Project Plan.docx
@@ -3401,12 +3401,10 @@
       </w:pPr>
       <w:proofErr w:type="spellStart"/>
       <w:r>
-        <w:t>Angular</w:t>
+        <w:t>Angular 21</w:t>
       </w:r>
       <w:proofErr w:type="spellEnd"/>
-      <w:r>
-        <w:t xml:space="preserve"> 18 </w:t>
-      </w:r>
+      <w:r/>
     </w:p>
     <w:p>
       <w:pPr>
@@ -3490,7 +3488,7 @@
         </w:numPr>
       </w:pPr>
       <w:r>
-        <w:t xml:space="preserve">PostgreSQL 16 </w:t>
+        <w:t>PostgreSQL 17</w:t>
       </w:r>
     </w:p>
     <w:p>

</xml_diff>